<commit_message>
Calculadora: ag7 max 3→4, ehErroEscusavel 5 condições; Manual: P156/P164/P264/P542/Glossário atualizados em azul
- ag7 (infraestrutura favorável): intervalo corrigido de +2/+3 para +2/+4
- ehErroEscusavel refatorado para 5 condições cumulativas: SF1.1, SF1.2, SF2.1, SF2.2 e SF3B.4a
  (concurso formal removido dos critérios de detecção)
- Alerta de erro escusável exibido também na Tela 9 (Resultado)
- Manual P156: teto −15 para atenuantes/bons antecedentes documentado
- Manual P164/P264: condições do erro escusável atualizadas para 5 subfatores
- Manual P542: "dispositivo único" substituído por "acesso limitado à norma"
- Manual Glossário: entrada "Erro escusável" atualizada com as 5 condições da v1.2

https://claude.ai/code/session_01HyfJBH68rzsxSW5gUr86Cc
</commit_message>
<xml_diff>
--- a/Manual_Calculadora_Dosimetria_TAC_v1_2.docx
+++ b/Manual_Calculadora_Dosimetria_TAC_v1_2.docx
@@ -10646,21 +10646,7 @@
                 <w:rStyle w:val="Hyperlink"/>
                 <w:noProof/>
               </w:rPr>
-              <w:t>19.3 Documentos de re</w:t>
-            </w:r>
-            <w:r>
-              <w:rPr>
-                <w:rStyle w:val="Hyperlink"/>
-                <w:noProof/>
-              </w:rPr>
-              <w:t>f</w:t>
-            </w:r>
-            <w:r>
-              <w:rPr>
-                <w:rStyle w:val="Hyperlink"/>
-                <w:noProof/>
-              </w:rPr>
-              <w:t>erência</w:t>
+              <w:t>19.3 Documentos de referência</w:t>
             </w:r>
             <w:r>
               <w:rPr>
@@ -11121,7 +11107,19 @@
         <w:jc w:val="both"/>
       </w:pPr>
       <w:r>
-        <w:t>Por mais de duas décadas após a edição da Lei nº 8.112, de 1990, o art. 128 funcionou como critério sem método: enunciava cinco elementos de graduação — natureza, gravidade, dano, circunstâncias e antecedentes —, mas não fornecia ao aplicador qualquer parâmetro objetivo sobre como distribuí-los no caso concreto. O resultado era previsível e documentado: decisões díspares para casos semelhantes, motivações genéricas que repetiam a literalidade do artigo sem explicar os pesos atribuídos, e ausência de instrumentos que permitissem à defesa ou ao controle externo verificar se a penalidade resultava de juízo fundamentado ou de impressão individual do julgador. A dosimetria disciplinar era, em grande medida, uma caixa-preta.</w:t>
+        <w:t>Por mais de duas décadas após a edição da Lei nº 8.112, de 1990, o art. 128 funcionou como critério sem método: enunciava cinco elementos de graduação</w:t>
+      </w:r>
+      <w:r>
+        <w:t xml:space="preserve"> (</w:t>
+      </w:r>
+      <w:r>
+        <w:t>natureza, gravidade, dano, circunstâncias e antecedentes</w:t>
+      </w:r>
+      <w:r>
+        <w:t>)</w:t>
+      </w:r>
+      <w:r>
+        <w:t>, mas não fornecia ao aplicador qualquer parâmetro objetivo sobre como distribuí-los no caso concreto. O resultado era previsível e documentado: decisões díspares para casos semelhantes, motivações genéricas que repetiam a literalidade do artigo sem explicar os pesos atribuídos, e ausência de instrumentos que permitissem à defesa ou ao controle externo verificar se a penalidade resultava de juízo fundamentado ou de impressão individual do julgador. A dosimetria disciplinar era, em grande medida, uma caixa-preta.</w:t>
       </w:r>
     </w:p>
     <w:p/>
@@ -11147,39 +11145,32 @@
         <w:jc w:val="both"/>
       </w:pPr>
       <w:r>
-        <w:t>Foi a Corregedoria-Geral da União, órgão central do Sistema de Correição do Poder Executivo Federal (SISCOR), que abriu o caminho para superar esse estado de coisas — e o fez por meio de uma contribuição que merece ser nomeada com a precisão que lhe é devida.</w:t>
-      </w:r>
-    </w:p>
-    <w:p/>
+        <w:t>Foi a Corregedoria-Geral da União, órgão central do Sistema de Correição do Poder Executivo Federal (SISCOR), que abriu o caminho para superar esse estado de coisas</w:t>
+      </w:r>
+      <w:r>
+        <w:t>,</w:t>
+      </w:r>
+      <w:r>
+        <w:t xml:space="preserve"> e o fez por meio de uma contribuição que merece ser nomeada com a precisão que lhe é devida.</w:t>
+      </w:r>
+    </w:p>
     <w:p>
       <w:pPr>
         <w:spacing w:before="80" w:after="80" w:line="276" w:lineRule="auto"/>
         <w:jc w:val="both"/>
       </w:pPr>
-      <w:r>
-        <w:t xml:space="preserve">Amanda Patrícia Sousa Dutra de Melo, José Ernane Barbosa de Castro e Cláudia Raquel Leão </w:t>
-      </w:r>
-      <w:proofErr w:type="spellStart"/>
-      <w:r>
-        <w:t>Brizolla</w:t>
-      </w:r>
-      <w:proofErr w:type="spellEnd"/>
-      <w:r>
-        <w:t xml:space="preserve">, no estudo "Dosimetria das Sanções Administrativas Disciplinares: Advertência e </w:t>
-      </w:r>
-      <w:r>
-        <w:lastRenderedPageBreak/>
-        <w:t>Suspensão", publicado no repositório institucional da CGU, construíram o primeiro método operacional completo para a graduação das penalidades de advertência e suspensão no âmbito do serviço público federal. Esse trabalho é o marco zero da dosimetria disciplinar sistematizada no Brasil — e é dele que derivam, direta ou indiretamente, todos os instrumentos que vieram depois, inclusive o presente Manual.</w:t>
-      </w:r>
-    </w:p>
-    <w:p/>
+    </w:p>
     <w:p>
       <w:pPr>
         <w:spacing w:before="80" w:after="80" w:line="276" w:lineRule="auto"/>
         <w:jc w:val="both"/>
       </w:pPr>
       <w:r>
-        <w:t>A contribuição dos autores foi de três ordens. Primeira, teórica: demonstraram que o silêncio do art. 128 sobre os pesos dos critérios não era convite à arbitrariedade, mas espaço a ser preenchido por método racional fundado nos próprios limites legais — a escala de advertência a suspensão de 90 dias como grade de referência para a distribuição dos pontos. Segunda, matemática: a partir de raciocínio equacional rigoroso, derivaram o valor de 21 pontos por elemento como o único que satisfaz simultaneamente as exigências de ser múltiplo de três, superior a 18 e compatível com os limites do art. 130 da Lei nº 8.112/90 — dedução que transformou uma escolha metodológica em necessidade lógica. Terceira, operacional: converteram o método em instrumento de uso imediato, com tabelas de graduação, régua de conversão e casos práticos que tornaram a dosimetria acessível a comissões processantes sem formação especializada.</w:t>
+        <w:t xml:space="preserve">Primeiramente, Armando de Nardi Neto e Fernanda Álvares da Rocha, ao apresentarem, em 2018, o Relatório da 21ª Reunião da Comissão de Coordenação de Correição, foram os primeiros a </w:t>
+      </w:r>
+      <w:r>
+        <w:lastRenderedPageBreak/>
+        <w:t>identificar e nomear o problema: diante do silêncio da Lei nº 8.112/90 quanto ao método de ponderação dos critérios do art. 128, a dosimetria disciplinar carecia de parâmetros objetivos, e essa lacuna comprometia a segurança jurídica e a isonomia das decisões em todo o Sistema de Correição do Poder Executivo Federal. Com essa percepção pioneira, os autores estruturaram o primeiro estudo referencial sobre os requisitos de dosimetria das penalidades no processo disciplinar e ousaram apresentar uma proposta inicial de modelo prático de pontuação — lançando, assim, a semente do que viria a seguir.</w:t>
       </w:r>
     </w:p>
     <w:p>
@@ -11194,7 +11185,7 @@
         <w:jc w:val="both"/>
       </w:pPr>
       <w:r>
-        <w:t xml:space="preserve">O Relatório apresentado na 21ª Reunião da Comissão de Coordenação de Correição havia lançado as primeiras intuições sobre a necessidade de sistematização. Melo, Castro e </w:t>
+        <w:t xml:space="preserve">Amanda Patrícia Sousa Dutra de Melo, José Ernane Barbosa de Castro e Cláudia Raquel Leão </w:t>
       </w:r>
       <w:proofErr w:type="spellStart"/>
       <w:r>
@@ -11202,77 +11193,75 @@
       </w:r>
       <w:proofErr w:type="spellEnd"/>
       <w:r>
-        <w:t xml:space="preserve"> transformaram essas intuições em método — e esse é o salto que distingue uma reflexão de uma contribuição.</w:t>
-      </w:r>
-    </w:p>
-    <w:p/>
-    <w:p>
-      <w:pPr>
-        <w:pStyle w:val="Ttulo3"/>
-      </w:pPr>
-      <w:bookmarkStart w:id="6" w:name="_Toc232258836"/>
-      <w:r>
-        <w:t>1.</w:t>
-      </w:r>
-      <w:r>
-        <w:t>2</w:t>
-      </w:r>
-      <w:r>
-        <w:t>.3 O que veio depois — e o que a CGU consolidou em 2024</w:t>
-      </w:r>
-      <w:bookmarkEnd w:id="6"/>
+        <w:t>, no estudo "Dosimetria das Sanções Administrativas Disciplinares: Advertência e Suspensão", publicado no repositório institucional da CGU, construíram o primeiro método operacional completo para a graduação das penalidades de advertência e suspensão no âmbito do serviço público federal. Esse trabalho é o marco zero da dosimetria disciplinar sistematizada no Brasil</w:t>
+      </w:r>
+      <w:r>
+        <w:t>,</w:t>
+      </w:r>
+      <w:r>
+        <w:t xml:space="preserve"> e é dele que derivam, direta ou indiretamente, todos os instrumentos que vieram depois, inclusive o presente Manual.</w:t>
+      </w:r>
     </w:p>
     <w:p>
       <w:pPr>
         <w:spacing w:before="80" w:after="80" w:line="276" w:lineRule="auto"/>
         <w:jc w:val="both"/>
       </w:pPr>
-      <w:r>
-        <w:t xml:space="preserve">O estudo fundador abriu caminho para o desenvolvimento de ferramentas eletrônicas que o materializaram em instrumento de uso cotidiano: as calculadoras de penalidade administrativa e de viabilidade de TAC, disponíveis no Portal de Corregedorias, operacionalizam diretamente os critérios e a régua de conversão que Melo, Castro e </w:t>
-      </w:r>
-      <w:proofErr w:type="spellStart"/>
-      <w:r>
-        <w:t>Brizolla</w:t>
-      </w:r>
-      <w:proofErr w:type="spellEnd"/>
-      <w:r>
-        <w:t xml:space="preserve"> estabeleceram.</w:t>
-      </w:r>
-    </w:p>
-    <w:p/>
+    </w:p>
     <w:p>
       <w:pPr>
         <w:spacing w:before="80" w:after="80" w:line="276" w:lineRule="auto"/>
         <w:jc w:val="both"/>
       </w:pPr>
       <w:r>
-        <w:t xml:space="preserve">Em 2024, a Corregedoria-Geral da União — então sob a gestão do Corregedor-Geral Ricardo Wagner de Araújo — avançou mais um passo com o Guia Teórico e Prático da Dosimetria da Sanção Disciplinar, elaborado por Amanda Patrícia Sousa Dutra de Melo e revisado por Amanda Cerqueira de Moraes, Bruno </w:t>
-      </w:r>
-      <w:proofErr w:type="spellStart"/>
-      <w:r>
-        <w:t>Wahl</w:t>
-      </w:r>
-      <w:proofErr w:type="spellEnd"/>
-      <w:r>
-        <w:t xml:space="preserve"> </w:t>
-      </w:r>
-      <w:proofErr w:type="spellStart"/>
-      <w:r>
-        <w:t>Goedert</w:t>
-      </w:r>
-      <w:proofErr w:type="spellEnd"/>
-      <w:r>
-        <w:t xml:space="preserve"> e José Trindade Monteiro Neto. Esse Guia deu ao método o que ainda lhe faltava: um roteiro operacional passo a passo com modelos de texto adaptáveis para a fundamentação processual, tornando a dosimetria acessível a qualquer operador do direito no âmbito do SISCOR.</w:t>
-      </w:r>
-    </w:p>
-    <w:p/>
+        <w:t>A contribuição dos autores foi de três ordens. Primeira, teórica: demonstraram que o silêncio do art. 128 sobre os pesos dos critérios não era convite à arbitrariedade, mas espaço a ser preenchido por método racional fundado nos próprios limites legais</w:t>
+      </w:r>
+      <w:r>
+        <w:t>,</w:t>
+      </w:r>
+      <w:r>
+        <w:t xml:space="preserve"> a escala de advertência a suspensão de 90 dias como grade de referência para a distribuição dos pontos. Segunda, matemática: a partir de raciocínio equacional rigoroso, derivaram o valor de 21 pontos por elemento como o único que satisfaz simultaneamente as exigências de ser múltiplo de três, superior a 18 e compatível com os limites do art. 130 da Lei nº 8.112/90</w:t>
+      </w:r>
+      <w:r>
+        <w:t>,</w:t>
+      </w:r>
+      <w:r>
+        <w:t xml:space="preserve"> dedução que transformou uma escolha metodológica em necessidade lógica. Terceira, operacional: converteram o método em instrumento de uso imediato, com tabelas de graduação, régua de conversão e casos práticos que tornaram a dosimetria acessível a comissões processantes sem formação especializada.</w:t>
+      </w:r>
+    </w:p>
     <w:p>
       <w:pPr>
         <w:spacing w:before="80" w:after="80" w:line="276" w:lineRule="auto"/>
         <w:jc w:val="both"/>
       </w:pPr>
-      <w:r>
-        <w:t>O conjunto dessas contribuições — o estudo fundador, as calculadoras e o Guia de 2024 — representa um dos avanços mais significativos na história recente do direito administrativo disciplinar brasileiro. Antes delas, a dosimetria era um exercício de retórica; depois delas, tornou-se procedimento estruturado, auditável e comparável entre processos.</w:t>
+    </w:p>
+    <w:p>
+      <w:pPr>
+        <w:spacing w:line="276" w:lineRule="auto"/>
+        <w:jc w:val="both"/>
+      </w:pPr>
+      <w:r>
+        <w:t>O Relatório de 2018</w:t>
+      </w:r>
+      <w:r>
+        <w:t xml:space="preserve">, de Nardi Neto e Rocha, </w:t>
+      </w:r>
+      <w:r>
+        <w:t>havia estabelecido os fundamentos e demonstrado a viabilidade do modelo</w:t>
+      </w:r>
+      <w:r>
+        <w:t>,</w:t>
+      </w:r>
+      <w:r>
+        <w:t xml:space="preserve"> uma contribuição que, por si só, já representava avanço considerável. Melo, Castro e </w:t>
+      </w:r>
+      <w:proofErr w:type="spellStart"/>
+      <w:r>
+        <w:t>Brizolla</w:t>
+      </w:r>
+      <w:proofErr w:type="spellEnd"/>
+      <w:r>
+        <w:t xml:space="preserve"> detalharam cada critério do art. 128, definiram faixas de graduação, articularam os elementos entre si e produziram um método completo, pronto para aplicação concreta</w:t>
       </w:r>
     </w:p>
     <w:p/>
@@ -11280,7 +11269,7 @@
       <w:pPr>
         <w:pStyle w:val="Ttulo3"/>
       </w:pPr>
-      <w:bookmarkStart w:id="7" w:name="_Toc232258837"/>
+      <w:bookmarkStart w:id="6" w:name="_Toc232258836"/>
       <w:r>
         <w:t>1.</w:t>
       </w:r>
@@ -11288,9 +11277,9 @@
         <w:t>2</w:t>
       </w:r>
       <w:r>
-        <w:t>.4 O que este Manual faz com essa herança</w:t>
-      </w:r>
-      <w:bookmarkEnd w:id="7"/>
+        <w:t>.3 O que veio depois — e o que a CGU consolidou em 2024</w:t>
+      </w:r>
+      <w:bookmarkEnd w:id="6"/>
     </w:p>
     <w:p>
       <w:pPr>
@@ -11298,31 +11287,15 @@
         <w:jc w:val="both"/>
       </w:pPr>
       <w:r>
-        <w:t>A Corregedoria da Secretaria Especial da Receita Federal do Brasil (</w:t>
+        <w:t xml:space="preserve">O estudo fundador abriu caminho para o desenvolvimento de ferramentas eletrônicas que o materializaram em instrumento de uso cotidiano: as calculadoras de penalidade administrativa e de viabilidade de TAC, disponíveis no Portal de Corregedorias, operacionalizam diretamente os critérios e a régua de conversão que Melo, Castro e </w:t>
       </w:r>
       <w:proofErr w:type="spellStart"/>
       <w:r>
-        <w:t>Coger</w:t>
+        <w:t>Brizolla</w:t>
       </w:r>
       <w:proofErr w:type="spellEnd"/>
       <w:r>
-        <w:t xml:space="preserve">/RFB) parte do trabalho de Melo, Castro e </w:t>
-      </w:r>
-      <w:proofErr w:type="spellStart"/>
-      <w:r>
-        <w:t>Brizolla</w:t>
-      </w:r>
-      <w:proofErr w:type="spellEnd"/>
-      <w:r>
-        <w:t xml:space="preserve"> — não apesar dele, mas por causa dele. É precisamente porque o método original é sólido que foi possível identificar, com clareza, os dois limites metodológicos que a experiência correcional da </w:t>
-      </w:r>
-      <w:proofErr w:type="spellStart"/>
-      <w:r>
-        <w:t>Coger</w:t>
-      </w:r>
-      <w:proofErr w:type="spellEnd"/>
-      <w:r>
-        <w:t>/RFB revelou ao longo do tempo.</w:t>
+        <w:t xml:space="preserve"> estabeleceram.</w:t>
       </w:r>
     </w:p>
     <w:p/>
@@ -11332,7 +11305,96 @@
         <w:jc w:val="both"/>
       </w:pPr>
       <w:r>
+        <w:t xml:space="preserve">Em 2024, a Corregedoria-Geral da União — então sob a gestão do Corregedor-Geral Ricardo Wagner de Araújo — avançou mais um passo com o Guia Teórico e Prático da Dosimetria da Sanção Disciplinar, elaborado por Amanda Patrícia Sousa Dutra de Melo e revisado por Amanda Cerqueira de Moraes, Bruno </w:t>
+      </w:r>
+      <w:proofErr w:type="spellStart"/>
+      <w:r>
+        <w:t>Wahl</w:t>
+      </w:r>
+      <w:proofErr w:type="spellEnd"/>
+      <w:r>
+        <w:t xml:space="preserve"> </w:t>
+      </w:r>
+      <w:proofErr w:type="spellStart"/>
+      <w:r>
+        <w:t>Goedert</w:t>
+      </w:r>
+      <w:proofErr w:type="spellEnd"/>
+      <w:r>
+        <w:t xml:space="preserve"> e José Trindade Monteiro Neto. Esse Guia deu ao método o que ainda lhe faltava: um roteiro operacional passo a passo com modelos de texto adaptáveis para a fundamentação processual, tornando a dosimetria acessível a qualquer operador do direito no âmbito do SISCOR.</w:t>
+      </w:r>
+    </w:p>
+    <w:p/>
+    <w:p>
+      <w:pPr>
+        <w:spacing w:before="80" w:after="80" w:line="276" w:lineRule="auto"/>
+        <w:jc w:val="both"/>
+      </w:pPr>
+      <w:r>
+        <w:t xml:space="preserve">O conjunto dessas contribuições — o estudo fundador, as calculadoras e o Guia de 2024 — representa um dos avanços mais significativos na história recente do direito administrativo </w:t>
+      </w:r>
+      <w:r>
         <w:lastRenderedPageBreak/>
+        <w:t>disciplinar brasileiro. Antes delas, a dosimetria era um exercício de retórica; depois delas, tornou-se procedimento estruturado, auditável e comparável entre processos.</w:t>
+      </w:r>
+    </w:p>
+    <w:p/>
+    <w:p>
+      <w:pPr>
+        <w:pStyle w:val="Ttulo3"/>
+      </w:pPr>
+      <w:bookmarkStart w:id="7" w:name="_Toc232258837"/>
+      <w:r>
+        <w:t>1.</w:t>
+      </w:r>
+      <w:r>
+        <w:t>2</w:t>
+      </w:r>
+      <w:r>
+        <w:t>.4 O que este Manual faz com essa herança</w:t>
+      </w:r>
+      <w:bookmarkEnd w:id="7"/>
+    </w:p>
+    <w:p>
+      <w:pPr>
+        <w:spacing w:before="80" w:after="80" w:line="276" w:lineRule="auto"/>
+        <w:jc w:val="both"/>
+      </w:pPr>
+      <w:r>
+        <w:t>A Corregedoria da Secretaria Especial da Receita Federal do Brasil (</w:t>
+      </w:r>
+      <w:proofErr w:type="spellStart"/>
+      <w:r>
+        <w:t>Coger</w:t>
+      </w:r>
+      <w:proofErr w:type="spellEnd"/>
+      <w:r>
+        <w:t xml:space="preserve">/RFB) parte do trabalho de Melo, Castro e </w:t>
+      </w:r>
+      <w:proofErr w:type="spellStart"/>
+      <w:r>
+        <w:t>Brizolla</w:t>
+      </w:r>
+      <w:proofErr w:type="spellEnd"/>
+      <w:r>
+        <w:t xml:space="preserve"> — não apesar dele, mas por causa dele. É precisamente porque o método original é sólido que foi possível identificar, com clareza, os dois limites metodológicos que a experiência correcional da </w:t>
+      </w:r>
+      <w:proofErr w:type="spellStart"/>
+      <w:r>
+        <w:t>Coger</w:t>
+      </w:r>
+      <w:proofErr w:type="spellEnd"/>
+      <w:r>
+        <w:t>/RFB revelou ao longo do tempo.</w:t>
+      </w:r>
+    </w:p>
+    <w:p/>
+    <w:p>
+      <w:pPr>
+        <w:spacing w:before="80" w:after="80" w:line="276" w:lineRule="auto"/>
+        <w:jc w:val="both"/>
+      </w:pPr>
+      <w:r>
         <w:t xml:space="preserve">O primeiro limite é a subjetividade residual dentro de cada elemento. O método define faixas de pontuação — culpa leve de 1 a 7, culpa grave de 8 a 14, dolo de 15 a 21 —, mas não especifica o que, dentro dessas faixas, justifica atribuir 3 em vez de 7, ou 16 em vez de 21. Essa abertura é virtude num instrumento de alcance nacional — os autores não poderiam, ao mesmo tempo, sistematizar a dosimetria para todo o SISCOR e subdividir os elementos em subfatores calibrados para realidades tão distintas quanto as de cada órgão federal. Mas o que é necessário num instrumento de uso geral torna-se insuficiente num instrumento de uso específico: a </w:t>
       </w:r>
       <w:proofErr w:type="spellStart"/>
@@ -11484,6 +11546,7 @@
         <w:spacing w:before="60" w:after="60" w:line="260" w:lineRule="auto"/>
       </w:pPr>
       <w:r>
+        <w:lastRenderedPageBreak/>
         <w:t>Demonstrar como cada conceito jurídico foi operacionalizado em subfatores e faixas de pontuação da Calculadora;</w:t>
       </w:r>
     </w:p>
@@ -11541,11 +11604,7 @@
         <w:jc w:val="both"/>
       </w:pPr>
       <w:r>
-        <w:t xml:space="preserve">A ferramenta aplica-se exclusivamente a infrações que comportem advertência (art. 129) ou suspensão de até 90 dias (art. 130). Infrações sujeitas a demissão, cassação de aposentadoria, </w:t>
-      </w:r>
-      <w:r>
-        <w:lastRenderedPageBreak/>
-        <w:t>destituição de cargo em comissão ou destituição de função comissionada (art. 132) estão fora do escopo.</w:t>
+        <w:t>A ferramenta aplica-se exclusivamente a infrações que comportem advertência (art. 129) ou suspensão de até 90 dias (art. 130). Infrações sujeitas a demissão, cassação de aposentadoria, destituição de cargo em comissão ou destituição de função comissionada (art. 132) estão fora do escopo.</w:t>
       </w:r>
     </w:p>
     <w:p/>
@@ -11627,32 +11686,23 @@
         <w:jc w:val="both"/>
       </w:pPr>
       <w:r>
-        <w:t xml:space="preserve">Há também um limite inferior de reprovabilidade. Quando a conduta configura erro escusável, descabe a sanção e a própria instauração do processo disciplinar. A combinação de culpa leve em qualquer grau (SF1.1) com conduta isolada (SF2.2) e ausência de concurso formal (SF2.3), quando o poder ofensivo intrínseco é ínfimo, resulta numa Soma Total muito baixa, orientando a autoridade para a hipótese de arquivamento (item 5.4). O dano efetivamente causado não integra a verificação do instituto, ou seja, a existência de prejuízo material não afasta, por si só, a caracterização do erro escusável, conforme assenta a Informação </w:t>
+        <w:rPr>
+          <w:color w:val="266399"/>
+        </w:rPr>
+        <w:t>Há também um limite inferior de reprovabilidade. Quando a conduta configura erro escusável, descabe a sanção e a própria instauração do processo disciplinar. A combinação de culpa leve em qualquer grau (SF1.1) com conduta isolada (SF2.2) e baixa ou média proteção institucional (SF2.3), quando o poder ofensivo intrínseco é ínfimo, resulta numa Soma Total muito baixa, orientando a autoridade para a hipótese de arquivamento (item 5.4). O dano efetivamente causado não integra a verificação do instituto, ou seja, a existência de prejuízo material não afasta, por si só, a caracterização do erro escusável, conforme assenta a Informação Coger/Codis/Diaco nº 129/2011.</w:t>
       </w:r>
       <w:proofErr w:type="spellStart"/>
-      <w:r>
-        <w:t>Coger</w:t>
-      </w:r>
+      <w:r/>
       <w:proofErr w:type="spellEnd"/>
-      <w:r>
-        <w:t>/</w:t>
-      </w:r>
+      <w:r/>
       <w:proofErr w:type="spellStart"/>
-      <w:r>
-        <w:t>Codis</w:t>
-      </w:r>
+      <w:r/>
       <w:proofErr w:type="spellEnd"/>
-      <w:r>
-        <w:t>/</w:t>
-      </w:r>
+      <w:r/>
       <w:proofErr w:type="spellStart"/>
-      <w:r>
-        <w:t>Diaco</w:t>
-      </w:r>
+      <w:r/>
       <w:proofErr w:type="spellEnd"/>
-      <w:r>
-        <w:t xml:space="preserve"> nº 129/2011.</w:t>
-      </w:r>
+      <w:r/>
     </w:p>
     <w:p>
       <w:pPr>
@@ -12093,6 +12143,7 @@
                 <w:sz w:val="18"/>
                 <w:szCs w:val="18"/>
               </w:rPr>
+              <w:lastRenderedPageBreak/>
               <w:t>Lei nº 9.784/1999</w:t>
             </w:r>
           </w:p>
@@ -12395,7 +12446,6 @@
                 <w:sz w:val="18"/>
                 <w:szCs w:val="18"/>
               </w:rPr>
-              <w:lastRenderedPageBreak/>
               <w:t>Jurisprudência sumular</w:t>
             </w:r>
           </w:p>
@@ -12635,7 +12685,6 @@
       </w:pPr>
       <w:bookmarkStart w:id="18" w:name="_Toc232258848"/>
       <w:r>
-        <w:lastRenderedPageBreak/>
         <w:t>2.5.2 A dupla dimensão do injusto: desvalor da ação e desvalor do resultado</w:t>
       </w:r>
       <w:bookmarkEnd w:id="18"/>
@@ -12877,7 +12926,11 @@
         <w:t>,</w:t>
       </w:r>
       <w:r>
-        <w:t xml:space="preserve"> situam-se na periferia do fato, qualificando-o sem constituí-lo. A consequência dogmática é direta: aquilo que apenas circunda o fato não pode pesar tanto quanto aquilo que o constitui. Um modelo que atribui às circunstâncias o mesmo teto dos elementos constitutivos dissolve a fronteira entre o ilícito e seu entorno, permitindo que o acessório module o principal em igualdade de condições</w:t>
+        <w:t xml:space="preserve"> situam-se na periferia do fato, qualificando-o sem constituí-lo. A consequência dogmática é direta: aquilo que apenas circunda o fato não pode pesar tanto quanto aquilo que o constitui. Um modelo que atribui </w:t>
+      </w:r>
+      <w:r>
+        <w:lastRenderedPageBreak/>
+        <w:t>às circunstâncias o mesmo teto dos elementos constitutivos dissolve a fronteira entre o ilícito e seu entorno, permitindo que o acessório module o principal em igualdade de condições</w:t>
       </w:r>
       <w:r>
         <w:t>,</w:t>
@@ -12903,7 +12956,6 @@
         <w:jc w:val="both"/>
       </w:pPr>
       <w:r>
-        <w:lastRenderedPageBreak/>
         <w:t>O argumento mais forte da ponderação assimétrica é de estatura constitucional. O direito sancionador brasileiro é um direito do fato, não um direito do autor: pune-se o que o agente fez, não o que o agente é ou foi. A culpabilidade pelo fato (</w:t>
       </w:r>
       <w:proofErr w:type="spellStart"/>
@@ -13060,14 +13112,14 @@
         <w:jc w:val="both"/>
       </w:pPr>
       <w:r>
-        <w:t>A contenção dos moduladores opera apenas no sentido agravante. Atenuantes e bons antecedentes não possuem teto negativo: podem reduzir a Soma Total sem limite inferior predeterminado (vedado apenas o resultado negativo). Essa assimetria é deliberada e reflete a orientação favor rei que informa todo o direito sancionador: a contenção dogmática dirige-se ao poder punitivo, não à defesa. O modelo é, assim, simultaneamente mais rigoroso na estrutura e mais generoso na mitigação</w:t>
-      </w:r>
-      <w:r>
-        <w:t>,</w:t>
-      </w:r>
-      <w:r>
-        <w:t xml:space="preserve"> combinação que reforça, e não enfraquece, sua compatibilidade com o regime de garantias do acusado.</w:t>
-      </w:r>
+        <w:rPr>
+          <w:color w:val="264D99"/>
+        </w:rPr>
+        <w:t>A contenção dos moduladores opera apenas no sentido agravante. Atenuantes e bons antecedentes operam com teto de −15 pontos, de modo simétrico ao teto de +15 aplicado às agravantes e maus antecedentes. Esse limite preserva a preponderância dos três elementos centrais do injusto (natureza, gravidade e dano) sobre os moduladores contextuais e históricos, em coerência com a ponderação assimétrica adotada no sistema. Essa assimetria é deliberada e reflete a orientação favor rei que informa todo o direito sancionador: a contenção dogmática dirige-se ao poder punitivo, não à defesa. O modelo é, assim, simultaneamente mais rigoroso na estrutura e mais generoso na mitigação, combinação que reforça, e não enfraquece, sua compatibilidade com o regime de garantias do acusado.</w:t>
+      </w:r>
+      <w:r/>
+      <w:r/>
+      <w:r/>
     </w:p>
     <w:p/>
     <w:p>
@@ -13076,7 +13128,6 @@
       </w:pPr>
       <w:bookmarkStart w:id="23" w:name="_Toc232258853"/>
       <w:r>
-        <w:lastRenderedPageBreak/>
         <w:t>2.5.7 Confirmações normativas</w:t>
       </w:r>
       <w:bookmarkEnd w:id="23"/>
@@ -13174,52 +13225,33 @@
         <w:jc w:val="both"/>
       </w:pPr>
       <w:r>
-        <w:t xml:space="preserve">A coerência interna do sistema se revela também no seu limite inferior. O erro escusável, instituto desenvolvido na seção 5.4, ocupa na escala de reprovabilidade a posição imediatamente anterior à culpa leve: não é um grau mínimo de culpa, mas a ausência de reprovabilidade punível. Seus três pressupostos cumulativos (ausência de dolo, eventualidade do erro e ofensa ínfima aos bens jurídicos tutelados) são todos internos ao juízo sobre a conduta em si, não sobre suas consequências: o dano efetivamente causado não integra a verificação do instituto, como deixa assente a Informação </w:t>
+        <w:rPr>
+          <w:color w:val="264D99"/>
+        </w:rPr>
+        <w:t>A coerência interna do sistema se revela também no seu limite inferior. O erro escusável, instituto desenvolvido na seção 5.4, ocupa na escala de reprovabilidade a posição imediatamente anterior à culpa leve: não é um grau mínimo de culpa, mas a ausência de reprovabilidade punível. Seus três pressupostos cumulativos (ausência de dolo, eventualidade do erro e ofensa ínfima aos bens jurídicos tutelados) são todos internos ao juízo sobre a conduta em si, não sobre suas consequências: o dano efetivamente causado não integra a verificação do instituto, como deixa assente a Informação Coger/Codis/Diaco nº 129/2011, que suprimiu o requisito de prejuízo material irrelevante da formulação original de 2006. Na arquitetura da Calculadora, esses pressupostos são operacionalizados por cinco condições cumulativas: SF1.1 (culpa leve grau 1 ou 2 — ausência de dolo); SF1.2 (acesso limitado à norma ou orientação, vals 0–4 — reforça a escusabilidade); SF2.1 (baixa proteção institucional do bem jurídico, val ≤ 7 — ínfimo poder ofensivo em abstrato); SF2.2 (conduta isolada — eventualidade do erro); e SF3B.4a (ausência de comprometimento de sigilo fiscal, val 0 — ínfimo poder ofensivo concreto). O concurso formal de dispositivos não integra os critérios de detecção do instituto. A Soma Total resultante dessa combinação é tão baixa que a ferramenta orienta a autoridade para a hipótese de arquivamento em vez de penalidade. Essa sinalização é consequência necessária da ponderação assimétrica: ao reservar peso majoritário ao núcleo do fato, o sistema garante que o patamar mínimo da escala reflita com precisão o limiar abaixo do qual a reprovabilidade não é apenas pequena, é inexistente, independentemente do resultado que a conduta tenha produzido. A verificação definitiva permanece sempre na autoridade competente, nos termos da NT Coger/RFB nº 12/2021..</w:t>
       </w:r>
       <w:proofErr w:type="spellStart"/>
-      <w:r>
-        <w:t>Coger</w:t>
-      </w:r>
+      <w:r/>
       <w:proofErr w:type="spellEnd"/>
-      <w:r>
-        <w:t>/</w:t>
-      </w:r>
+      <w:r/>
       <w:proofErr w:type="spellStart"/>
-      <w:r>
-        <w:t>Codis</w:t>
-      </w:r>
+      <w:r/>
       <w:proofErr w:type="spellEnd"/>
-      <w:r>
-        <w:t>/</w:t>
-      </w:r>
+      <w:r/>
       <w:proofErr w:type="spellStart"/>
-      <w:r>
-        <w:t>Diaco</w:t>
-      </w:r>
+      <w:r/>
       <w:proofErr w:type="spellEnd"/>
-      <w:r>
-        <w:t xml:space="preserve"> nº 129/2011, que suprimiu o requisito de prejuízo material irrelevante da formulação original de 2006. Na arquitetura da Calculadora, esses três pressupostos correspondem a elementos do Elemento 1 — Natureza: SF1.1 (culpa leve em qualquer grau, excluindo o dolo), SF2.2 (conduta isolada, captando a eventualidade) e SF2.3 (ausência de concurso formal de dispositivos — </w:t>
-      </w:r>
+      <w:r/>
       <w:proofErr w:type="spellStart"/>
-      <w:r>
-        <w:t>val</w:t>
-      </w:r>
+      <w:r/>
       <w:proofErr w:type="spellEnd"/>
-      <w:r>
-        <w:t xml:space="preserve"> 0). A Soma Total resultante dessa combinação é tão baixa que a ferramenta orienta a autoridade para a hipótese de arquivamento em vez de penalidade. Essa sinalização é consequência necessária da ponderação assimétrica: ao reservar peso majoritário ao núcleo do fato, o sistema garante que o patamar mínimo da escala reflita com precisão o limiar abaixo do qual a reprovabilidade não é apenas pequena, é inexistente, independentemente do resultado que a conduta tenha produzido. A verificação definitiva permanece sempre na autoridade competente, nos termos da NT </w:t>
-      </w:r>
+      <w:r/>
       <w:proofErr w:type="spellStart"/>
-      <w:r>
-        <w:t>Coger</w:t>
-      </w:r>
+      <w:r/>
       <w:proofErr w:type="spellEnd"/>
-      <w:r>
-        <w:t>/RFB nº 12/</w:t>
-      </w:r>
+      <w:r/>
       <w:proofErr w:type="gramStart"/>
-      <w:r>
-        <w:t>2021..</w:t>
-      </w:r>
+      <w:r/>
       <w:proofErr w:type="gramEnd"/>
     </w:p>
     <w:p>
@@ -17438,7 +17470,13 @@
         <w:jc w:val="both"/>
       </w:pPr>
       <w:r>
-        <w:t>A diferenciação de regimes não viola a isonomia — pressupõe-na em sua dimensão material. A isonomia material exige que a resposta do sistema seja proporcional às distinções que o próprio ordenamento reconheceu como juridicamente relevantes. Quando o legislador distinguiu, o intérprete não pode nivelar. Os regimes especiais garantem que o servidor que viola norma de regime qualificado não se beneficie da mesma escala de conversão daquele que viola norma ordinária — e, simetricamente, que o servidor em regime de teto reduzido (RE2) não seja submetido à escala de um regime mais gravoso.</w:t>
+        <w:t>A diferenciação de regimes não viola a isonomia</w:t>
+      </w:r>
+      <w:r>
+        <w:t>,</w:t>
+      </w:r>
+      <w:r>
+        <w:t xml:space="preserve"> pressupõe-na em sua dimensão material. A isonomia material exige que a resposta do sistema seja proporcional às distinções que o próprio ordenamento reconheceu como juridicamente relevantes. Quando o legislador distinguiu, o intérprete não pode nivelar. Os regimes especiais garantem que o servidor que viola norma de regime qualificado não se beneficie da mesma escala de conversão daquele que viola norma ordinária e, simetricamente, que o servidor em regime de teto reduzido (RE2) não seja submetido à escala de um regime mais gravoso.</w:t>
       </w:r>
     </w:p>
     <w:p>
@@ -19290,64 +19328,39 @@
         <w:jc w:val="both"/>
       </w:pPr>
       <w:r>
-        <w:t>Na versão 1.0, o erro escusável é detectado por meio de três condições cumulativas verificadas nos subfatores SF1.1, SF2.2 e SF2.3. Não há tela ou campo exclusivo para o instituto. A Calculadora sinaliza possível erro escusável quando: (a) SF1.1 indica culpa leve em qualquer grau (</w:t>
+        <w:rPr>
+          <w:color w:val="264D99"/>
+        </w:rPr>
+        <w:t>Na versão 1.0, o erro escusável é detectado por meio de cinco condições cumulativas. Não há tela ou campo exclusivo para o instituto. A Calculadora sinaliza possível erro escusável quando: (a) SF1.1 indica culpa leve grau 1 (val 2) ou grau 2 (val 5); (b) SF1.2 indica acesso limitado à norma ou orientação (vals 0–4); (c) SF2.1 indica baixa proteção institucional do bem jurídico (val ≤ 7); (d) SF2.2 indica conduta isolada (vals 1, 3 ou 5); e (e) não houve comprometimento de sigilo fiscal ou proteção de dados (SF3B.4a = 0). O concurso formal de dispositivos (SF2.3) não integra os critérios de detecção. Quando as cinco condições se verificam simultaneamente, o resultado global sinaliza, para a autoridade, que a conduta pode comportar arquivamento em vez de penalidade. O dano efetivamente causado (Elemento 3)  não é critério de verificação do erro escusável: a existência de prejuízo material, por si só, não afasta o instituto, conforme assenta a Informação Coger/Codis/Diaco nº 129/2011.</w:t>
       </w:r>
       <w:proofErr w:type="spellStart"/>
-      <w:r>
-        <w:t>vals</w:t>
-      </w:r>
+      <w:r/>
       <w:proofErr w:type="spellEnd"/>
-      <w:r>
-        <w:t xml:space="preserve"> 2, 5 ou 8); (b) SF2.2 indica conduta isolada (</w:t>
-      </w:r>
+      <w:r/>
       <w:proofErr w:type="spellStart"/>
-      <w:r>
-        <w:t>vals</w:t>
-      </w:r>
+      <w:r/>
       <w:proofErr w:type="spellEnd"/>
-      <w:r>
-        <w:t xml:space="preserve"> 1, 3 ou 5); e (c) SF2.3 indica ausência de concurso formal (</w:t>
-      </w:r>
+      <w:r/>
       <w:proofErr w:type="spellStart"/>
-      <w:r>
-        <w:t>val</w:t>
-      </w:r>
+      <w:r/>
       <w:proofErr w:type="spellEnd"/>
-      <w:r>
-        <w:t xml:space="preserve"> 0). Quando as três condições se verificam simultaneamente, o resultado global sinaliza, para a autoridade, que a conduta pode comportar arquivamento em vez de penalidade. O dano efetivamente causado (Elemento 3</w:t>
-      </w:r>
+      <w:r/>
       <w:proofErr w:type="gramStart"/>
-      <w:r>
-        <w:t>)  não</w:t>
-      </w:r>
+      <w:r/>
       <w:proofErr w:type="gramEnd"/>
-      <w:r>
-        <w:t xml:space="preserve"> é critério de verificação do erro escusável: a existência de prejuízo material, por si só, não afasta o instituto, conforme assenta a Informação </w:t>
-      </w:r>
+      <w:r/>
       <w:proofErr w:type="spellStart"/>
-      <w:r>
-        <w:t>Coger</w:t>
-      </w:r>
+      <w:r/>
       <w:proofErr w:type="spellEnd"/>
-      <w:r>
-        <w:t>/</w:t>
-      </w:r>
+      <w:r/>
       <w:proofErr w:type="spellStart"/>
-      <w:r>
-        <w:t>Codis</w:t>
-      </w:r>
+      <w:r/>
       <w:proofErr w:type="spellEnd"/>
-      <w:r>
-        <w:t>/</w:t>
-      </w:r>
+      <w:r/>
       <w:proofErr w:type="spellStart"/>
-      <w:r>
-        <w:t>Diaco</w:t>
-      </w:r>
+      <w:r/>
       <w:proofErr w:type="spellEnd"/>
-      <w:r>
-        <w:t xml:space="preserve"> nº 129/2011.</w:t>
-      </w:r>
+      <w:r/>
     </w:p>
     <w:p>
       <w:pPr>
@@ -34126,16 +34139,15 @@
         <w:jc w:val="both"/>
       </w:pPr>
       <w:r>
-        <w:t xml:space="preserve">O conjunto de respostas é próximo do perfil de erro escusável — baixíssima reprovabilidade subjetiva, conduta isolada, dispositivo único — mas o envolvimento de dados sigilosos, ainda que em grau mínimo, afasta automaticamente a sinalização do instituto (NT </w:t>
+        <w:rPr>
+          <w:color w:val="264D99"/>
+        </w:rPr>
+        <w:t>O conjunto de respostas é próximo do perfil de erro escusável — baixíssima reprovabilidade subjetiva, conduta isolada, acesso limitado à norma — mas o envolvimento de dados sigilosos, ainda que em grau mínimo, afasta automaticamente a sinalização do instituto (NT Coger/RFB nº 12/2021, condição 6). O sigilo fiscal é bem jurídico nuclear da missão da RFB, e qualquer comprometimento concreto dele, por menor que seja, é incompatível com a caracterização do erro escusável. Verifique se o envolvimento de dados sigilosos está corretamente pontuado e fundamente no campo de complementação de SF3B.4a.</w:t>
       </w:r>
       <w:proofErr w:type="spellStart"/>
-      <w:r>
-        <w:t>Coger</w:t>
-      </w:r>
+      <w:r/>
       <w:proofErr w:type="spellEnd"/>
-      <w:r>
-        <w:t>/RFB nº 12/2021, condição 6). O sigilo fiscal é bem jurídico nuclear da missão da RFB, e qualquer comprometimento concreto dele, por menor que seja, é incompatível com a caracterização do erro escusável. Verifique se o envolvimento de dados sigilosos está corretamente pontuado e fundamente no campo de complementação de SF3B.4a.</w:t>
-      </w:r>
+      <w:r/>
     </w:p>
     <w:p>
       <w:pPr>
@@ -36864,10 +36876,11 @@
             </w:pPr>
             <w:r>
               <w:rPr>
-                <w:sz w:val="17"/>
-                <w:szCs w:val="17"/>
-              </w:rPr>
-              <w:t xml:space="preserve">Equívoco funcional não punível: ausência de dolo, eventualidade do erro e ínfimo poder ofensivo da conduta (tese da </w:t>
+                <w:color w:val="264D99"/>
+                <w:sz w:val="17"/>
+                <w:szCs w:val="17"/>
+              </w:rPr>
+              <w:t>Equívoco funcional não punível: ausência de dolo, eventualidade do erro e ínfimo poder ofensivo da conduta (tese da Coger/RFB; NT nº 2006/1 e nº 12/2021). Na calculadora, sinalizado pela combinação de cinco condições cumulativas: (1) SF1.1 — culpa leve grau 1 (val 2) ou grau 2 (val 5); (2) SF1.2 — acesso limitado à norma (val 0–4); (3) SF2.1 — baixa proteção institucional (val ≤ 7); (4) SF2.2 — conduta isolada (vals 1, 3 ou 5); (5) SF3B.4a — conduta sem envolvimento de dados sigilosos (val 0). O concurso formal de dispositivos (SF2.3) não integra os critérios de detecção do instituto. O dano efetivamente causado não é requisito — a existência de prejuízo material não afasta o instituto (Informação Coger/Codis/Diaco nº 129/2011).</w:t>
             </w:r>
             <w:proofErr w:type="spellStart"/>
             <w:r>
@@ -36875,7 +36888,6 @@
                 <w:sz w:val="17"/>
                 <w:szCs w:val="17"/>
               </w:rPr>
-              <w:t>Coger</w:t>
             </w:r>
             <w:proofErr w:type="spellEnd"/>
             <w:r>
@@ -36883,7 +36895,6 @@
                 <w:sz w:val="17"/>
                 <w:szCs w:val="17"/>
               </w:rPr>
-              <w:t xml:space="preserve">/RFB; NT nº 2006/1 e nº 12/2021). Na v1.0, sinalizado pela combinação de SF1.1 (culpa leve, qualquer grau: </w:t>
             </w:r>
             <w:proofErr w:type="spellStart"/>
             <w:r>
@@ -36891,7 +36902,6 @@
                 <w:sz w:val="17"/>
                 <w:szCs w:val="17"/>
               </w:rPr>
-              <w:t>vals</w:t>
             </w:r>
             <w:proofErr w:type="spellEnd"/>
             <w:r>
@@ -36899,7 +36909,6 @@
                 <w:sz w:val="17"/>
                 <w:szCs w:val="17"/>
               </w:rPr>
-              <w:t xml:space="preserve"> 2, 5 ou 8), conduta isolada (SF2.2: </w:t>
             </w:r>
             <w:proofErr w:type="spellStart"/>
             <w:r>
@@ -36907,7 +36916,6 @@
                 <w:sz w:val="17"/>
                 <w:szCs w:val="17"/>
               </w:rPr>
-              <w:t>vals</w:t>
             </w:r>
             <w:proofErr w:type="spellEnd"/>
             <w:r>
@@ -36915,7 +36923,6 @@
                 <w:sz w:val="17"/>
                 <w:szCs w:val="17"/>
               </w:rPr>
-              <w:t xml:space="preserve"> 1, 3 ou 5) e ausência de concurso formal (SF2.3 = 0). O dano efetivamente causado não é requisito — a existência de prejuízo material não afasta o instituto (Informação </w:t>
             </w:r>
             <w:proofErr w:type="spellStart"/>
             <w:r>
@@ -36923,7 +36930,6 @@
                 <w:sz w:val="17"/>
                 <w:szCs w:val="17"/>
               </w:rPr>
-              <w:t>Coger</w:t>
             </w:r>
             <w:proofErr w:type="spellEnd"/>
             <w:r>
@@ -36931,7 +36937,6 @@
                 <w:sz w:val="17"/>
                 <w:szCs w:val="17"/>
               </w:rPr>
-              <w:t>/</w:t>
             </w:r>
             <w:proofErr w:type="spellStart"/>
             <w:r>
@@ -36939,7 +36944,6 @@
                 <w:sz w:val="17"/>
                 <w:szCs w:val="17"/>
               </w:rPr>
-              <w:t>Codis</w:t>
             </w:r>
             <w:proofErr w:type="spellEnd"/>
             <w:r>
@@ -36947,7 +36951,6 @@
                 <w:sz w:val="17"/>
                 <w:szCs w:val="17"/>
               </w:rPr>
-              <w:t>/</w:t>
             </w:r>
             <w:proofErr w:type="spellStart"/>
             <w:r>
@@ -36955,7 +36958,6 @@
                 <w:sz w:val="17"/>
                 <w:szCs w:val="17"/>
               </w:rPr>
-              <w:t>Diaco</w:t>
             </w:r>
             <w:proofErr w:type="spellEnd"/>
             <w:r>
@@ -36963,7 +36965,6 @@
                 <w:sz w:val="17"/>
                 <w:szCs w:val="17"/>
               </w:rPr>
-              <w:t xml:space="preserve"> nº 129/2011).</w:t>
             </w:r>
           </w:p>
         </w:tc>
@@ -38320,6 +38321,19 @@
       </w:pPr>
       <w:r>
         <w:t>MUNHOZ DE MELLO, Rafael. Princípios Constitucionais de Direito Administrativo Sancionador: as sanções administrativas à luz da Constituição Federal de 1988. São Paulo: Malheiros, 2007.</w:t>
+      </w:r>
+    </w:p>
+    <w:p>
+      <w:pPr>
+        <w:pStyle w:val="PargrafodaLista"/>
+        <w:numPr>
+          <w:ilvl w:val="0"/>
+          <w:numId w:val="2"/>
+        </w:numPr>
+        <w:spacing w:before="60" w:after="60" w:line="260" w:lineRule="auto"/>
+      </w:pPr>
+      <w:r>
+        <w:t>NARDI NETO, Armando de; ROCHA, Fernanda Álvares da. Estudo referencial sobre os requisitos utilizados na dosimetria das penalidades no PAD, com apresentação de um modelo prático. Relatório apresentado na 21ª Reunião da Comissão de Coordenação de Correição. Brasília: Ministério da Transparência e Controladoria-Geral da União, Corregedoria-Geral da União, 27 nov. 2018.</w:t>
       </w:r>
     </w:p>
     <w:p>
@@ -38744,63 +38758,7 @@
         <w:rPr>
           <w:rStyle w:val="Refdenotaderodap"/>
         </w:rPr>
-        <w:t xml:space="preserve"> WELZEL, Hans. Das Deutsche </w:t>
-      </w:r>
-      <w:proofErr w:type="spellStart"/>
-      <w:r>
-        <w:rPr>
-          <w:rStyle w:val="Refdenotaderodap"/>
-        </w:rPr>
-        <w:t>Strafrecht</w:t>
-      </w:r>
-      <w:proofErr w:type="spellEnd"/>
-      <w:r>
-        <w:rPr>
-          <w:rStyle w:val="Refdenotaderodap"/>
-        </w:rPr>
-        <w:t xml:space="preserve">. 11. ed. Berlin: Walter de Gruyter, 1969, § 12. Tradução espanhola: El </w:t>
-      </w:r>
-      <w:proofErr w:type="spellStart"/>
-      <w:r>
-        <w:rPr>
-          <w:rStyle w:val="Refdenotaderodap"/>
-        </w:rPr>
-        <w:t>derecho</w:t>
-      </w:r>
-      <w:proofErr w:type="spellEnd"/>
-      <w:r>
-        <w:rPr>
-          <w:rStyle w:val="Refdenotaderodap"/>
-        </w:rPr>
-        <w:t xml:space="preserve"> penal </w:t>
-      </w:r>
-      <w:proofErr w:type="spellStart"/>
-      <w:r>
-        <w:rPr>
-          <w:rStyle w:val="Refdenotaderodap"/>
-        </w:rPr>
-        <w:t>alemán</w:t>
-      </w:r>
-      <w:proofErr w:type="spellEnd"/>
-      <w:r>
-        <w:rPr>
-          <w:rStyle w:val="Refdenotaderodap"/>
-        </w:rPr>
-        <w:t xml:space="preserve">: parte general. Trad. Juan Bustos Ramírez e Sergio Yáñez Pérez. 4. ed. Santiago: Editorial Jurídica de Chile, 1997, cap. referente à estrutura do injusto. Versão introdutória: El </w:t>
-      </w:r>
-      <w:proofErr w:type="spellStart"/>
-      <w:r>
-        <w:rPr>
-          <w:rStyle w:val="Refdenotaderodap"/>
-        </w:rPr>
-        <w:t>nuevo</w:t>
-      </w:r>
-      <w:proofErr w:type="spellEnd"/>
-      <w:r>
-        <w:rPr>
-          <w:rStyle w:val="Refdenotaderodap"/>
-        </w:rPr>
-        <w:t xml:space="preserve"> sistema del derecho penal: una introducción a la doctrina de la acción finalista. Trad. José Cerezo Mir. Barcelona: Ariel, 1964, cap. III.</w:t>
+        <w:t xml:space="preserve"> WELZEL, Hans. Das Deutsche Strafrecht. 11. ed. Berlin: Walter de Gruyter, 1969, § 12. Tradução espanhola: El derecho penal alemán: parte general. Trad. Juan Bustos Ramírez e Sergio Yáñez Pérez. 4. ed. Santiago: Editorial Jurídica de Chile, 1997, cap. referente à estrutura do injusto. Versão introdutória: El nuevo sistema del derecho penal: una introducción a la doctrina de la acción finalista. Trad. José Cerezo Mir. Barcelona: Ariel, 1964, cap. III.</w:t>
       </w:r>
     </w:p>
   </w:footnote>
@@ -38874,35 +38832,7 @@
         <w:rPr>
           <w:rStyle w:val="Refdenotaderodap"/>
         </w:rPr>
-        <w:t xml:space="preserve"> ROXIN, Claus; GRECO, Luís. Direito Penal: Parte Geral. Tomo I: Fundamentos — A Estrutura da Teoria do Crime. São Paulo: Marcial Pons, 2024, § 19 (Questões fundamentais da teoria da responsabilidade). Edição anterior: ROXIN, Claus. </w:t>
-      </w:r>
-      <w:proofErr w:type="spellStart"/>
-      <w:r>
-        <w:rPr>
-          <w:rStyle w:val="Refdenotaderodap"/>
-        </w:rPr>
-        <w:t>Derecho</w:t>
-      </w:r>
-      <w:proofErr w:type="spellEnd"/>
-      <w:r>
-        <w:rPr>
-          <w:rStyle w:val="Refdenotaderodap"/>
-        </w:rPr>
-        <w:t xml:space="preserve"> Penal: Parte General. Tomo I. 2. ed. Trad. Diego-Manuel Luzón Peña et al. Madrid: </w:t>
-      </w:r>
-      <w:proofErr w:type="spellStart"/>
-      <w:r>
-        <w:rPr>
-          <w:rStyle w:val="Refdenotaderodap"/>
-        </w:rPr>
-        <w:t>Civitas</w:t>
-      </w:r>
-      <w:proofErr w:type="spellEnd"/>
-      <w:r>
-        <w:rPr>
-          <w:rStyle w:val="Refdenotaderodap"/>
-        </w:rPr>
-        <w:t>, 1997, § 19.</w:t>
+        <w:t xml:space="preserve"> ROXIN, Claus; GRECO, Luís. Direito Penal: Parte Geral. Tomo I: Fundamentos — A Estrutura da Teoria do Crime. São Paulo: Marcial Pons, 2024, § 19 (Questões fundamentais da teoria da responsabilidade). Edição anterior: ROXIN, Claus. Derecho Penal: Parte General. Tomo I. 2. ed. Trad. Diego-Manuel Luzón Peña et al. Madrid: Civitas, 1997, § 19.</w:t>
       </w:r>
     </w:p>
   </w:footnote>
@@ -38925,63 +38855,7 @@
         <w:rPr>
           <w:rStyle w:val="Refdenotaderodap"/>
         </w:rPr>
-        <w:t xml:space="preserve"> ZAFFARONI, Eugenio </w:t>
-      </w:r>
-      <w:proofErr w:type="spellStart"/>
-      <w:r>
-        <w:rPr>
-          <w:rStyle w:val="Refdenotaderodap"/>
-        </w:rPr>
-        <w:t>Raúl</w:t>
-      </w:r>
-      <w:proofErr w:type="spellEnd"/>
-      <w:r>
-        <w:rPr>
-          <w:rStyle w:val="Refdenotaderodap"/>
-        </w:rPr>
-        <w:t xml:space="preserve">; ALAGIA, Alejandro; SLOKAR, Alejandro. </w:t>
-      </w:r>
-      <w:proofErr w:type="spellStart"/>
-      <w:r>
-        <w:rPr>
-          <w:rStyle w:val="Refdenotaderodap"/>
-        </w:rPr>
-        <w:t>Derecho</w:t>
-      </w:r>
-      <w:proofErr w:type="spellEnd"/>
-      <w:r>
-        <w:rPr>
-          <w:rStyle w:val="Refdenotaderodap"/>
-        </w:rPr>
-        <w:t xml:space="preserve"> Penal: Parte General. 2. ed. Buenos Aires: </w:t>
-      </w:r>
-      <w:proofErr w:type="spellStart"/>
-      <w:r>
-        <w:rPr>
-          <w:rStyle w:val="Refdenotaderodap"/>
-        </w:rPr>
-        <w:t>Ediar</w:t>
-      </w:r>
-      <w:proofErr w:type="spellEnd"/>
-      <w:r>
-        <w:rPr>
-          <w:rStyle w:val="Refdenotaderodap"/>
-        </w:rPr>
-        <w:t xml:space="preserve">, 2002, § 18. Versão brasileira equivalente: ZAFFARONI, Eugenio </w:t>
-      </w:r>
-      <w:proofErr w:type="spellStart"/>
-      <w:r>
-        <w:rPr>
-          <w:rStyle w:val="Refdenotaderodap"/>
-        </w:rPr>
-        <w:t>Raúl</w:t>
-      </w:r>
-      <w:proofErr w:type="spellEnd"/>
-      <w:r>
-        <w:rPr>
-          <w:rStyle w:val="Refdenotaderodap"/>
-        </w:rPr>
-        <w:t>; PIERANGELI, José Henrique. Manual de Direito Penal Brasileiro: Parte Geral. 12. ed. São Paulo: Revista dos Tribunais, 2018, cap. sobre culpabilidade.</w:t>
+        <w:t xml:space="preserve"> ZAFFARONI, Eugenio Raúl; ALAGIA, Alejandro; SLOKAR, Alejandro. Derecho Penal: Parte General. 2. ed. Buenos Aires: Ediar, 2002, § 18. Versão brasileira equivalente: ZAFFARONI, Eugenio Raúl; PIERANGELI, José Henrique. Manual de Direito Penal Brasileiro: Parte Geral. 12. ed. São Paulo: Revista dos Tribunais, 2018, cap. sobre culpabilidade.</w:t>
       </w:r>
     </w:p>
   </w:footnote>
@@ -39027,21 +38901,7 @@
         <w:rPr>
           <w:rStyle w:val="Refdenotaderodap"/>
         </w:rPr>
-        <w:t xml:space="preserve"> HUNGRIA, Nelson. O arbítrio judicial na medida da pena. In: HUNGRIA, Nelson. Comentários ao Código Penal. v. V (</w:t>
-      </w:r>
-      <w:proofErr w:type="spellStart"/>
-      <w:r>
-        <w:rPr>
-          <w:rStyle w:val="Refdenotaderodap"/>
-        </w:rPr>
-        <w:t>arts</w:t>
-      </w:r>
-      <w:proofErr w:type="spellEnd"/>
-      <w:r>
-        <w:rPr>
-          <w:rStyle w:val="Refdenotaderodap"/>
-        </w:rPr>
-        <w:t>. 121 a 136). Rio de Janeiro: Revista Forense, 1942. Passagem reproduzida em: CONJUR. Dosimetria da pena: ensinamento de Nelson Hungria segue atual. Consultor Jurídico, 3 dez. 2025. Disponível em: &lt;https://www.conjur.com.br/2025-dez-03/ensinamentos-de-nelson-hungria-sobre-dosimetria-da-pena-seguem-atuais/&gt;.</w:t>
+        <w:t xml:space="preserve"> HUNGRIA, Nelson. O arbítrio judicial na medida da pena. In: HUNGRIA, Nelson. Comentários ao Código Penal. v. V (arts. 121 a 136). Rio de Janeiro: Revista Forense, 1942. Passagem reproduzida em: CONJUR. Dosimetria da pena: ensinamento de Nelson Hungria segue atual. Consultor Jurídico, 3 dez. 2025. Disponível em: &lt;https://www.conjur.com.br/2025-dez-03/ensinamentos-de-nelson-hungria-sobre-dosimetria-da-pena-seguem-atuais/&gt;.</w:t>
       </w:r>
     </w:p>
   </w:footnote>

</xml_diff>